<commit_message>
Before the real QR
</commit_message>
<xml_diff>
--- a/resources/templates/Sterling_Bond_Template.docx
+++ b/resources/templates/Sterling_Bond_Template.docx
@@ -2,16 +2,6 @@
 <file path=word/document.xml><?xml version="1.0" encoding="utf-8"?>
 <w:document xmlns:wpc="http://schemas.microsoft.com/office/word/2010/wordprocessingCanvas" xmlns:mc="http://schemas.openxmlformats.org/markup-compatibility/2006" xmlns:o="urn:schemas-microsoft-com:office:office" xmlns:r="http://schemas.openxmlformats.org/officeDocument/2006/relationships" xmlns:m="http://schemas.openxmlformats.org/officeDocument/2006/math" xmlns:v="urn:schemas-microsoft-com:vml" xmlns:wp14="http://schemas.microsoft.com/office/word/2010/wordprocessingDrawing" xmlns:wp="http://schemas.openxmlformats.org/drawingml/2006/wordprocessingDrawing" xmlns:w="http://schemas.openxmlformats.org/wordprocessingml/2006/main" xmlns:w14="http://schemas.microsoft.com/office/word/2010/wordml" xmlns:w10="urn:schemas-microsoft-com:office:word" xmlns:w15="http://schemas.microsoft.com/office/word/2012/wordml" xmlns:wpg="http://schemas.microsoft.com/office/word/2010/wordprocessingGroup" xmlns:wpi="http://schemas.microsoft.com/office/word/2010/wordprocessingInk" xmlns:wne="http://schemas.microsoft.com/office/word/2006/wordml" xmlns:wps="http://schemas.microsoft.com/office/word/2010/wordprocessingShape" xmlns:wpsCustomData="http://www.wps.cn/officeDocument/2013/wpsCustomData" mc:Ignorable="w14 w15 wp14">
   <w:body>
-    <w:p>
-      <w:pPr>
-        <w:rPr>
-          <w:rFonts w:hint="default" w:ascii="Arial" w:hAnsi="Arial" w:cs="Arial"/>
-          <w:sz w:val="24"/>
-          <w:szCs w:val="24"/>
-          <w:lang w:val="en-US"/>
-        </w:rPr>
-      </w:pPr>
-    </w:p>
     <w:p>
       <w:pPr>
         <w:rPr>
@@ -393,8 +383,6 @@
         </w:rPr>
         <w:t>[[Endorsement]]</w:t>
       </w:r>
-      <w:bookmarkStart w:id="0" w:name="_GoBack"/>
-      <w:bookmarkEnd w:id="0"/>
       <w:r>
         <w:rPr>
           <w:rFonts w:hint="default" w:ascii="Arial" w:hAnsi="Arial" w:cs="Arial"/>
@@ -794,6 +782,248 @@
           <w:lang w:val="en-US"/>
         </w:rPr>
       </w:pPr>
+      <w:bookmarkStart w:id="0" w:name="_GoBack"/>
+      <w:bookmarkEnd w:id="0"/>
+      <w:r>
+        <w:rPr>
+          <w:sz w:val="24"/>
+        </w:rPr>
+        <mc:AlternateContent>
+          <mc:Choice Requires="wps">
+            <w:drawing>
+              <wp:anchor distT="0" distB="0" distL="114300" distR="114300" simplePos="0" relativeHeight="251660288" behindDoc="0" locked="0" layoutInCell="1" allowOverlap="1">
+                <wp:simplePos x="0" y="0"/>
+                <wp:positionH relativeFrom="column">
+                  <wp:posOffset>-773430</wp:posOffset>
+                </wp:positionH>
+                <wp:positionV relativeFrom="paragraph">
+                  <wp:posOffset>5591175</wp:posOffset>
+                </wp:positionV>
+                <wp:extent cx="1808480" cy="259715"/>
+                <wp:effectExtent l="0" t="0" r="1270" b="6985"/>
+                <wp:wrapNone/>
+                <wp:docPr id="1" name="Text Box 1"/>
+                <wp:cNvGraphicFramePr/>
+                <a:graphic xmlns:a="http://schemas.openxmlformats.org/drawingml/2006/main">
+                  <a:graphicData uri="http://schemas.microsoft.com/office/word/2010/wordprocessingShape">
+                    <wps:wsp>
+                      <wps:cNvSpPr txBox="1"/>
+                      <wps:spPr>
+                        <a:xfrm>
+                          <a:off x="833755" y="11050270"/>
+                          <a:ext cx="1808480" cy="259715"/>
+                        </a:xfrm>
+                        <a:prstGeom prst="rect">
+                          <a:avLst/>
+                        </a:prstGeom>
+                        <a:solidFill>
+                          <a:schemeClr val="lt1"/>
+                        </a:solidFill>
+                        <a:ln w="6350">
+                          <a:noFill/>
+                        </a:ln>
+                      </wps:spPr>
+                      <wps:style>
+                        <a:lnRef idx="0">
+                          <a:schemeClr val="accent1"/>
+                        </a:lnRef>
+                        <a:fillRef idx="0">
+                          <a:schemeClr val="accent1"/>
+                        </a:fillRef>
+                        <a:effectRef idx="0">
+                          <a:schemeClr val="accent1"/>
+                        </a:effectRef>
+                        <a:fontRef idx="minor">
+                          <a:schemeClr val="dk1"/>
+                        </a:fontRef>
+                      </wps:style>
+                      <wps:txbx>
+                        <w:txbxContent>
+                          <w:p>
+                            <w:pPr>
+                              <w:rPr>
+                                <w:rFonts w:hint="default" w:ascii="Arial" w:hAnsi="Arial" w:cs="Arial"/>
+                                <w:sz w:val="24"/>
+                                <w:szCs w:val="24"/>
+                                <w:lang w:val="en-US"/>
+                              </w:rPr>
+                            </w:pPr>
+                            <w:r>
+                              <w:rPr>
+                                <w:rFonts w:hint="default" w:ascii="Arial" w:hAnsi="Arial" w:cs="Arial"/>
+                                <w:sz w:val="24"/>
+                                <w:szCs w:val="24"/>
+                                <w:lang w:val="en-US"/>
+                              </w:rPr>
+                              <w:t>[[Confirmation Number]]</w:t>
+                            </w:r>
+                          </w:p>
+                        </w:txbxContent>
+                      </wps:txbx>
+                      <wps:bodyPr rot="0" spcFirstLastPara="0" vertOverflow="overflow" horzOverflow="overflow" vert="horz" wrap="square" lIns="91440" tIns="45720" rIns="91440" bIns="45720" numCol="1" spcCol="0" rtlCol="0" fromWordArt="0" anchor="t" anchorCtr="0" forceAA="0" compatLnSpc="1">
+                        <a:noAutofit/>
+                      </wps:bodyPr>
+                    </wps:wsp>
+                  </a:graphicData>
+                </a:graphic>
+              </wp:anchor>
+            </w:drawing>
+          </mc:Choice>
+          <mc:Fallback>
+            <w:pict>
+              <v:shape id="_x0000_s1026" o:spid="_x0000_s1026" o:spt="202" type="#_x0000_t202" style="position:absolute;left:0pt;margin-left:-60.9pt;margin-top:440.25pt;height:20.45pt;width:142.4pt;z-index:251660288;mso-width-relative:page;mso-height-relative:page;" fillcolor="#FFFFFF [3201]" filled="t" stroked="f" coordsize="21600,21600" o:gfxdata="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">
+                <v:fill on="t" focussize="0,0"/>
+                <v:stroke on="f" weight="0.5pt"/>
+                <v:imagedata o:title=""/>
+                <o:lock v:ext="edit" aspectratio="f"/>
+                <v:textbox>
+                  <w:txbxContent>
+                    <w:p>
+                      <w:pPr>
+                        <w:rPr>
+                          <w:rFonts w:hint="default" w:ascii="Arial" w:hAnsi="Arial" w:cs="Arial"/>
+                          <w:sz w:val="24"/>
+                          <w:szCs w:val="24"/>
+                          <w:lang w:val="en-US"/>
+                        </w:rPr>
+                      </w:pPr>
+                      <w:r>
+                        <w:rPr>
+                          <w:rFonts w:hint="default" w:ascii="Arial" w:hAnsi="Arial" w:cs="Arial"/>
+                          <w:sz w:val="24"/>
+                          <w:szCs w:val="24"/>
+                          <w:lang w:val="en-US"/>
+                        </w:rPr>
+                        <w:t>[[Confirmation Number]]</w:t>
+                      </w:r>
+                    </w:p>
+                  </w:txbxContent>
+                </v:textbox>
+              </v:shape>
+            </w:pict>
+          </mc:Fallback>
+        </mc:AlternateContent>
+      </w:r>
+      <w:r>
+        <w:rPr>
+          <w:sz w:val="24"/>
+        </w:rPr>
+        <mc:AlternateContent>
+          <mc:Choice Requires="wps">
+            <w:drawing>
+              <wp:anchor distT="0" distB="0" distL="114300" distR="114300" simplePos="0" relativeHeight="251661312" behindDoc="0" locked="0" layoutInCell="1" allowOverlap="1">
+                <wp:simplePos x="0" y="0"/>
+                <wp:positionH relativeFrom="column">
+                  <wp:posOffset>-473710</wp:posOffset>
+                </wp:positionH>
+                <wp:positionV relativeFrom="paragraph">
+                  <wp:posOffset>5101590</wp:posOffset>
+                </wp:positionV>
+                <wp:extent cx="596900" cy="259715"/>
+                <wp:effectExtent l="0" t="0" r="12700" b="6985"/>
+                <wp:wrapNone/>
+                <wp:docPr id="3" name="Text Box 3"/>
+                <wp:cNvGraphicFramePr/>
+                <a:graphic xmlns:a="http://schemas.openxmlformats.org/drawingml/2006/main">
+                  <a:graphicData uri="http://schemas.microsoft.com/office/word/2010/wordprocessingShape">
+                    <wps:wsp>
+                      <wps:cNvSpPr txBox="1"/>
+                      <wps:spPr>
+                        <a:xfrm>
+                          <a:off x="0" y="0"/>
+                          <a:ext cx="596900" cy="259715"/>
+                        </a:xfrm>
+                        <a:prstGeom prst="rect">
+                          <a:avLst/>
+                        </a:prstGeom>
+                        <a:solidFill>
+                          <a:schemeClr val="lt1"/>
+                        </a:solidFill>
+                        <a:ln w="6350">
+                          <a:noFill/>
+                        </a:ln>
+                      </wps:spPr>
+                      <wps:style>
+                        <a:lnRef idx="0">
+                          <a:schemeClr val="accent1"/>
+                        </a:lnRef>
+                        <a:fillRef idx="0">
+                          <a:schemeClr val="accent1"/>
+                        </a:fillRef>
+                        <a:effectRef idx="0">
+                          <a:schemeClr val="accent1"/>
+                        </a:effectRef>
+                        <a:fontRef idx="minor">
+                          <a:schemeClr val="dk1"/>
+                        </a:fontRef>
+                      </wps:style>
+                      <wps:txbx>
+                        <w:txbxContent>
+                          <w:p>
+                            <w:pPr>
+                              <w:rPr>
+                                <w:rFonts w:hint="default" w:ascii="Arial" w:hAnsi="Arial" w:cs="Arial"/>
+                                <w:sz w:val="24"/>
+                                <w:szCs w:val="24"/>
+                                <w:lang w:val="en-US"/>
+                              </w:rPr>
+                            </w:pPr>
+                            <w:r>
+                              <w:rPr>
+                                <w:rFonts w:hint="default" w:ascii="Arial" w:hAnsi="Arial" w:cs="Arial"/>
+                                <w:sz w:val="24"/>
+                                <w:szCs w:val="24"/>
+                                <w:lang w:val="en-US"/>
+                              </w:rPr>
+                              <w:t>[[QR]]</w:t>
+                            </w:r>
+                          </w:p>
+                        </w:txbxContent>
+                      </wps:txbx>
+                      <wps:bodyPr rot="0" spcFirstLastPara="0" vertOverflow="overflow" horzOverflow="overflow" vert="horz" wrap="square" lIns="91440" tIns="45720" rIns="91440" bIns="45720" numCol="1" spcCol="0" rtlCol="0" fromWordArt="0" anchor="t" anchorCtr="0" forceAA="0" compatLnSpc="1">
+                        <a:noAutofit/>
+                      </wps:bodyPr>
+                    </wps:wsp>
+                  </a:graphicData>
+                </a:graphic>
+              </wp:anchor>
+            </w:drawing>
+          </mc:Choice>
+          <mc:Fallback>
+            <w:pict>
+              <v:shape id="_x0000_s1026" o:spid="_x0000_s1026" o:spt="202" type="#_x0000_t202" style="position:absolute;left:0pt;margin-left:-37.3pt;margin-top:401.7pt;height:20.45pt;width:47pt;z-index:251661312;mso-width-relative:page;mso-height-relative:page;" fillcolor="#FFFFFF [3201]" filled="t" stroked="f" coordsize="21600,21600" o:gfxdata="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">
+                <v:fill on="t" focussize="0,0"/>
+                <v:stroke on="f" weight="0.5pt"/>
+                <v:imagedata o:title=""/>
+                <o:lock v:ext="edit" aspectratio="f"/>
+                <v:textbox>
+                  <w:txbxContent>
+                    <w:p>
+                      <w:pPr>
+                        <w:rPr>
+                          <w:rFonts w:hint="default" w:ascii="Arial" w:hAnsi="Arial" w:cs="Arial"/>
+                          <w:sz w:val="24"/>
+                          <w:szCs w:val="24"/>
+                          <w:lang w:val="en-US"/>
+                        </w:rPr>
+                      </w:pPr>
+                      <w:r>
+                        <w:rPr>
+                          <w:rFonts w:hint="default" w:ascii="Arial" w:hAnsi="Arial" w:cs="Arial"/>
+                          <w:sz w:val="24"/>
+                          <w:szCs w:val="24"/>
+                          <w:lang w:val="en-US"/>
+                        </w:rPr>
+                        <w:t>[[QR]]</w:t>
+                      </w:r>
+                    </w:p>
+                  </w:txbxContent>
+                </v:textbox>
+              </v:shape>
+            </w:pict>
+          </mc:Fallback>
+        </mc:AlternateContent>
+      </w:r>
       <w:r>
         <w:rPr>
           <w:rFonts w:hint="default" w:ascii="Arial" w:hAnsi="Arial" w:cs="Arial"/>
@@ -934,7 +1164,7 @@
     </w:p>
     <w:sectPr>
       <w:pgSz w:w="12240" w:h="20160"/>
-      <w:pgMar w:top="1440" w:right="1800" w:bottom="1440" w:left="1800" w:header="720" w:footer="720" w:gutter="0"/>
+      <w:pgMar w:top="1440" w:right="1800" w:bottom="1440" w:left="1440" w:header="720" w:footer="720" w:gutter="0"/>
       <w:cols w:space="720" w:num="1"/>
       <w:docGrid w:linePitch="360" w:charSpace="0"/>
     </w:sectPr>
@@ -1298,7 +1528,7 @@
     <w:lsdException w:qFormat="1" w:unhideWhenUsed="0" w:uiPriority="61" w:semiHidden="0" w:name="Light List"/>
     <w:lsdException w:qFormat="1" w:unhideWhenUsed="0" w:uiPriority="62" w:semiHidden="0" w:name="Light Grid"/>
     <w:lsdException w:qFormat="1" w:unhideWhenUsed="0" w:uiPriority="63" w:semiHidden="0" w:name="Medium Shading 1"/>
-    <w:lsdException w:unhideWhenUsed="0" w:uiPriority="64" w:semiHidden="0" w:name="Medium Shading 2"/>
+    <w:lsdException w:qFormat="1" w:unhideWhenUsed="0" w:uiPriority="64" w:semiHidden="0" w:name="Medium Shading 2"/>
     <w:lsdException w:qFormat="1" w:unhideWhenUsed="0" w:uiPriority="65" w:semiHidden="0" w:name="Medium List 1"/>
     <w:lsdException w:qFormat="1" w:unhideWhenUsed="0" w:uiPriority="66" w:semiHidden="0" w:name="Medium List 2"/>
     <w:lsdException w:qFormat="1" w:unhideWhenUsed="0" w:uiPriority="67" w:semiHidden="0" w:name="Medium Grid 1"/>
@@ -1306,14 +1536,14 @@
     <w:lsdException w:unhideWhenUsed="0" w:uiPriority="69" w:semiHidden="0" w:name="Medium Grid 3"/>
     <w:lsdException w:qFormat="1" w:unhideWhenUsed="0" w:uiPriority="70" w:semiHidden="0" w:name="Dark List"/>
     <w:lsdException w:qFormat="1" w:unhideWhenUsed="0" w:uiPriority="71" w:semiHidden="0" w:name="Colorful Shading"/>
-    <w:lsdException w:unhideWhenUsed="0" w:uiPriority="72" w:semiHidden="0" w:name="Colorful List"/>
+    <w:lsdException w:qFormat="1" w:unhideWhenUsed="0" w:uiPriority="72" w:semiHidden="0" w:name="Colorful List"/>
     <w:lsdException w:qFormat="1" w:unhideWhenUsed="0" w:uiPriority="73" w:semiHidden="0" w:name="Colorful Grid"/>
     <w:lsdException w:qFormat="1" w:unhideWhenUsed="0" w:uiPriority="60" w:semiHidden="0" w:name="Light Shading Accent 1"/>
     <w:lsdException w:qFormat="1" w:unhideWhenUsed="0" w:uiPriority="61" w:semiHidden="0" w:name="Light List Accent 1"/>
     <w:lsdException w:qFormat="1" w:unhideWhenUsed="0" w:uiPriority="62" w:semiHidden="0" w:name="Light Grid Accent 1"/>
     <w:lsdException w:qFormat="1" w:unhideWhenUsed="0" w:uiPriority="63" w:semiHidden="0" w:name="Medium Shading 1 Accent 1"/>
-    <w:lsdException w:unhideWhenUsed="0" w:uiPriority="64" w:semiHidden="0" w:name="Medium Shading 2 Accent 1"/>
-    <w:lsdException w:unhideWhenUsed="0" w:uiPriority="65" w:semiHidden="0" w:name="Medium List 1 Accent 1"/>
+    <w:lsdException w:qFormat="1" w:unhideWhenUsed="0" w:uiPriority="64" w:semiHidden="0" w:name="Medium Shading 2 Accent 1"/>
+    <w:lsdException w:qFormat="1" w:unhideWhenUsed="0" w:uiPriority="65" w:semiHidden="0" w:name="Medium List 1 Accent 1"/>
     <w:lsdException w:qFormat="1" w:unhideWhenUsed="0" w:uiPriority="34" w:semiHidden="0" w:name="List Paragraph"/>
     <w:lsdException w:qFormat="1" w:unhideWhenUsed="0" w:uiPriority="29" w:semiHidden="0" w:name="Quote"/>
     <w:lsdException w:qFormat="1" w:unhideWhenUsed="0" w:uiPriority="30" w:semiHidden="0" w:name="Intense Quote"/>
@@ -1323,7 +1553,7 @@
     <w:lsdException w:qFormat="1" w:unhideWhenUsed="0" w:uiPriority="69" w:semiHidden="0" w:name="Medium Grid 3 Accent 1"/>
     <w:lsdException w:qFormat="1" w:unhideWhenUsed="0" w:uiPriority="70" w:semiHidden="0" w:name="Dark List Accent 1"/>
     <w:lsdException w:qFormat="1" w:unhideWhenUsed="0" w:uiPriority="71" w:semiHidden="0" w:name="Colorful Shading Accent 1"/>
-    <w:lsdException w:unhideWhenUsed="0" w:uiPriority="72" w:semiHidden="0" w:name="Colorful List Accent 1"/>
+    <w:lsdException w:qFormat="1" w:unhideWhenUsed="0" w:uiPriority="72" w:semiHidden="0" w:name="Colorful List Accent 1"/>
     <w:lsdException w:qFormat="1" w:unhideWhenUsed="0" w:uiPriority="73" w:semiHidden="0" w:name="Colorful Grid Accent 1"/>
     <w:lsdException w:qFormat="1" w:unhideWhenUsed="0" w:uiPriority="60" w:semiHidden="0" w:name="Light Shading Accent 2"/>
     <w:lsdException w:qFormat="1" w:unhideWhenUsed="0" w:uiPriority="61" w:semiHidden="0" w:name="Light List Accent 2"/>
@@ -1337,13 +1567,13 @@
     <w:lsdException w:qFormat="1" w:unhideWhenUsed="0" w:uiPriority="69" w:semiHidden="0" w:name="Medium Grid 3 Accent 2"/>
     <w:lsdException w:unhideWhenUsed="0" w:uiPriority="70" w:semiHidden="0" w:name="Dark List Accent 2"/>
     <w:lsdException w:qFormat="1" w:unhideWhenUsed="0" w:uiPriority="71" w:semiHidden="0" w:name="Colorful Shading Accent 2"/>
-    <w:lsdException w:unhideWhenUsed="0" w:uiPriority="72" w:semiHidden="0" w:name="Colorful List Accent 2"/>
+    <w:lsdException w:qFormat="1" w:unhideWhenUsed="0" w:uiPriority="72" w:semiHidden="0" w:name="Colorful List Accent 2"/>
     <w:lsdException w:qFormat="1" w:unhideWhenUsed="0" w:uiPriority="73" w:semiHidden="0" w:name="Colorful Grid Accent 2"/>
     <w:lsdException w:qFormat="1" w:unhideWhenUsed="0" w:uiPriority="60" w:semiHidden="0" w:name="Light Shading Accent 3"/>
     <w:lsdException w:qFormat="1" w:unhideWhenUsed="0" w:uiPriority="61" w:semiHidden="0" w:name="Light List Accent 3"/>
     <w:lsdException w:qFormat="1" w:unhideWhenUsed="0" w:uiPriority="62" w:semiHidden="0" w:name="Light Grid Accent 3"/>
     <w:lsdException w:qFormat="1" w:unhideWhenUsed="0" w:uiPriority="63" w:semiHidden="0" w:name="Medium Shading 1 Accent 3"/>
-    <w:lsdException w:unhideWhenUsed="0" w:uiPriority="64" w:semiHidden="0" w:name="Medium Shading 2 Accent 3"/>
+    <w:lsdException w:qFormat="1" w:unhideWhenUsed="0" w:uiPriority="64" w:semiHidden="0" w:name="Medium Shading 2 Accent 3"/>
     <w:lsdException w:qFormat="1" w:unhideWhenUsed="0" w:uiPriority="65" w:semiHidden="0" w:name="Medium List 1 Accent 3"/>
     <w:lsdException w:qFormat="1" w:unhideWhenUsed="0" w:uiPriority="66" w:semiHidden="0" w:name="Medium List 2 Accent 3"/>
     <w:lsdException w:qFormat="1" w:unhideWhenUsed="0" w:uiPriority="67" w:semiHidden="0" w:name="Medium Grid 1 Accent 3"/>
@@ -1352,7 +1582,7 @@
     <w:lsdException w:qFormat="1" w:unhideWhenUsed="0" w:uiPriority="70" w:semiHidden="0" w:name="Dark List Accent 3"/>
     <w:lsdException w:qFormat="1" w:unhideWhenUsed="0" w:uiPriority="71" w:semiHidden="0" w:name="Colorful Shading Accent 3"/>
     <w:lsdException w:qFormat="1" w:unhideWhenUsed="0" w:uiPriority="72" w:semiHidden="0" w:name="Colorful List Accent 3"/>
-    <w:lsdException w:unhideWhenUsed="0" w:uiPriority="73" w:semiHidden="0" w:name="Colorful Grid Accent 3"/>
+    <w:lsdException w:qFormat="1" w:unhideWhenUsed="0" w:uiPriority="73" w:semiHidden="0" w:name="Colorful Grid Accent 3"/>
     <w:lsdException w:qFormat="1" w:unhideWhenUsed="0" w:uiPriority="60" w:semiHidden="0" w:name="Light Shading Accent 4"/>
     <w:lsdException w:qFormat="1" w:unhideWhenUsed="0" w:uiPriority="61" w:semiHidden="0" w:name="Light List Accent 4"/>
     <w:lsdException w:qFormat="1" w:unhideWhenUsed="0" w:uiPriority="62" w:semiHidden="0" w:name="Light Grid Accent 4"/>
@@ -1364,7 +1594,7 @@
     <w:lsdException w:qFormat="1" w:unhideWhenUsed="0" w:uiPriority="68" w:semiHidden="0" w:name="Medium Grid 2 Accent 4"/>
     <w:lsdException w:qFormat="1" w:unhideWhenUsed="0" w:uiPriority="69" w:semiHidden="0" w:name="Medium Grid 3 Accent 4"/>
     <w:lsdException w:unhideWhenUsed="0" w:uiPriority="70" w:semiHidden="0" w:name="Dark List Accent 4"/>
-    <w:lsdException w:unhideWhenUsed="0" w:uiPriority="71" w:semiHidden="0" w:name="Colorful Shading Accent 4"/>
+    <w:lsdException w:qFormat="1" w:unhideWhenUsed="0" w:uiPriority="71" w:semiHidden="0" w:name="Colorful Shading Accent 4"/>
     <w:lsdException w:qFormat="1" w:unhideWhenUsed="0" w:uiPriority="72" w:semiHidden="0" w:name="Colorful List Accent 4"/>
     <w:lsdException w:qFormat="1" w:unhideWhenUsed="0" w:uiPriority="73" w:semiHidden="0" w:name="Colorful Grid Accent 4"/>
     <w:lsdException w:qFormat="1" w:unhideWhenUsed="0" w:uiPriority="60" w:semiHidden="0" w:name="Light Shading Accent 5"/>
@@ -1376,10 +1606,10 @@
     <w:lsdException w:qFormat="1" w:unhideWhenUsed="0" w:uiPriority="66" w:semiHidden="0" w:name="Medium List 2 Accent 5"/>
     <w:lsdException w:qFormat="1" w:unhideWhenUsed="0" w:uiPriority="67" w:semiHidden="0" w:name="Medium Grid 1 Accent 5"/>
     <w:lsdException w:qFormat="1" w:unhideWhenUsed="0" w:uiPriority="68" w:semiHidden="0" w:name="Medium Grid 2 Accent 5"/>
-    <w:lsdException w:unhideWhenUsed="0" w:uiPriority="69" w:semiHidden="0" w:name="Medium Grid 3 Accent 5"/>
+    <w:lsdException w:qFormat="1" w:unhideWhenUsed="0" w:uiPriority="69" w:semiHidden="0" w:name="Medium Grid 3 Accent 5"/>
     <w:lsdException w:qFormat="1" w:unhideWhenUsed="0" w:uiPriority="70" w:semiHidden="0" w:name="Dark List Accent 5"/>
-    <w:lsdException w:unhideWhenUsed="0" w:uiPriority="71" w:semiHidden="0" w:name="Colorful Shading Accent 5"/>
-    <w:lsdException w:unhideWhenUsed="0" w:uiPriority="72" w:semiHidden="0" w:name="Colorful List Accent 5"/>
+    <w:lsdException w:qFormat="1" w:unhideWhenUsed="0" w:uiPriority="71" w:semiHidden="0" w:name="Colorful Shading Accent 5"/>
+    <w:lsdException w:qFormat="1" w:unhideWhenUsed="0" w:uiPriority="72" w:semiHidden="0" w:name="Colorful List Accent 5"/>
     <w:lsdException w:unhideWhenUsed="0" w:uiPriority="73" w:semiHidden="0" w:name="Colorful Grid Accent 5"/>
     <w:lsdException w:qFormat="1" w:unhideWhenUsed="0" w:uiPriority="60" w:semiHidden="0" w:name="Light Shading Accent 6"/>
     <w:lsdException w:qFormat="1" w:unhideWhenUsed="0" w:uiPriority="61" w:semiHidden="0" w:name="Light List Accent 6"/>
@@ -1390,7 +1620,7 @@
     <w:lsdException w:qFormat="1" w:unhideWhenUsed="0" w:uiPriority="66" w:semiHidden="0" w:name="Medium List 2 Accent 6"/>
     <w:lsdException w:qFormat="1" w:unhideWhenUsed="0" w:uiPriority="67" w:semiHidden="0" w:name="Medium Grid 1 Accent 6"/>
     <w:lsdException w:qFormat="1" w:unhideWhenUsed="0" w:uiPriority="68" w:semiHidden="0" w:name="Medium Grid 2 Accent 6"/>
-    <w:lsdException w:unhideWhenUsed="0" w:uiPriority="69" w:semiHidden="0" w:name="Medium Grid 3 Accent 6"/>
+    <w:lsdException w:qFormat="1" w:unhideWhenUsed="0" w:uiPriority="69" w:semiHidden="0" w:name="Medium Grid 3 Accent 6"/>
     <w:lsdException w:qFormat="1" w:unhideWhenUsed="0" w:uiPriority="70" w:semiHidden="0" w:name="Dark List Accent 6"/>
     <w:lsdException w:qFormat="1" w:unhideWhenUsed="0" w:uiPriority="71" w:semiHidden="0" w:name="Colorful Shading Accent 6"/>
     <w:lsdException w:qFormat="1" w:unhideWhenUsed="0" w:uiPriority="72" w:semiHidden="0" w:name="Colorful List Accent 6"/>
@@ -5033,6 +5263,7 @@
   <w:style w:type="table" w:styleId="65">
     <w:name w:val="Medium Shading 2"/>
     <w:basedOn w:val="12"/>
+    <w:qFormat/>
     <w:uiPriority w:val="64"/>
     <w:pPr>
       <w:spacing w:after="0" w:line="240" w:lineRule="auto"/>
@@ -5198,6 +5429,7 @@
   <w:style w:type="table" w:styleId="66">
     <w:name w:val="Medium Shading 2 Accent 1"/>
     <w:basedOn w:val="12"/>
+    <w:qFormat/>
     <w:uiPriority w:val="64"/>
     <w:pPr>
       <w:spacing w:after="0" w:line="240" w:lineRule="auto"/>
@@ -5529,6 +5761,7 @@
   <w:style w:type="table" w:styleId="68">
     <w:name w:val="Medium Shading 2 Accent 3"/>
     <w:basedOn w:val="12"/>
+    <w:qFormat/>
     <w:uiPriority w:val="64"/>
     <w:pPr>
       <w:spacing w:after="0" w:line="240" w:lineRule="auto"/>
@@ -6283,6 +6516,7 @@
   <w:style w:type="table" w:styleId="73">
     <w:name w:val="Medium List 1 Accent 1"/>
     <w:basedOn w:val="12"/>
+    <w:qFormat/>
     <w:uiPriority w:val="65"/>
     <w:pPr>
       <w:spacing w:after="0" w:line="240" w:lineRule="auto"/>
@@ -10046,6 +10280,7 @@
   <w:style w:type="table" w:styleId="105">
     <w:name w:val="Medium Grid 3 Accent 5"/>
     <w:basedOn w:val="12"/>
+    <w:qFormat/>
     <w:uiPriority w:val="69"/>
     <w:pPr>
       <w:spacing w:after="0" w:line="240" w:lineRule="auto"/>
@@ -10203,6 +10438,7 @@
   <w:style w:type="table" w:styleId="106">
     <w:name w:val="Medium Grid 3 Accent 6"/>
     <w:basedOn w:val="12"/>
+    <w:qFormat/>
     <w:uiPriority w:val="69"/>
     <w:pPr>
       <w:spacing w:after="0" w:line="240" w:lineRule="auto"/>
@@ -11746,6 +11982,7 @@
   <w:style w:type="table" w:styleId="118">
     <w:name w:val="Colorful Shading Accent 4"/>
     <w:basedOn w:val="12"/>
+    <w:qFormat/>
     <w:uiPriority w:val="71"/>
     <w:pPr>
       <w:spacing w:after="0" w:line="240" w:lineRule="auto"/>
@@ -11894,6 +12131,7 @@
   <w:style w:type="table" w:styleId="119">
     <w:name w:val="Colorful Shading Accent 5"/>
     <w:basedOn w:val="12"/>
+    <w:qFormat/>
     <w:uiPriority w:val="71"/>
     <w:pPr>
       <w:spacing w:after="0" w:line="240" w:lineRule="auto"/>
@@ -12191,6 +12429,7 @@
   <w:style w:type="table" w:styleId="121">
     <w:name w:val="Colorful List"/>
     <w:basedOn w:val="12"/>
+    <w:qFormat/>
     <w:uiPriority w:val="72"/>
     <w:pPr>
       <w:spacing w:after="0" w:line="240" w:lineRule="auto"/>
@@ -12283,6 +12522,7 @@
   <w:style w:type="table" w:styleId="122">
     <w:name w:val="Colorful List Accent 1"/>
     <w:basedOn w:val="12"/>
+    <w:qFormat/>
     <w:uiPriority w:val="72"/>
     <w:pPr>
       <w:spacing w:after="0" w:line="240" w:lineRule="auto"/>
@@ -12375,6 +12615,7 @@
   <w:style w:type="table" w:styleId="123">
     <w:name w:val="Colorful List Accent 2"/>
     <w:basedOn w:val="12"/>
+    <w:qFormat/>
     <w:uiPriority w:val="72"/>
     <w:pPr>
       <w:spacing w:after="0" w:line="240" w:lineRule="auto"/>
@@ -12653,6 +12894,7 @@
   <w:style w:type="table" w:styleId="126">
     <w:name w:val="Colorful List Accent 5"/>
     <w:basedOn w:val="12"/>
+    <w:qFormat/>
     <w:uiPriority w:val="72"/>
     <w:pPr>
       <w:spacing w:after="0" w:line="240" w:lineRule="auto"/>
@@ -13129,6 +13371,7 @@
   <w:style w:type="table" w:styleId="131">
     <w:name w:val="Colorful Grid Accent 3"/>
     <w:basedOn w:val="12"/>
+    <w:qFormat/>
     <w:uiPriority w:val="73"/>
     <w:pPr>
       <w:spacing w:after="0" w:line="240" w:lineRule="auto"/>

</xml_diff>

<commit_message>
Template and Notary Edit Fix
</commit_message>
<xml_diff>
--- a/resources/templates/Sterling_Bond_Template.docx
+++ b/resources/templates/Sterling_Bond_Template.docx
@@ -16,9 +16,9 @@
     <w:p>
       <w:pPr>
         <w:rPr>
-          <w:rFonts w:hint="default" w:ascii="Arial" w:hAnsi="Arial" w:cs="Arial"/>
-          <w:sz w:val="24"/>
-          <w:szCs w:val="24"/>
+          <w:rFonts w:hint="default" w:ascii="Calibri" w:hAnsi="Calibri" w:cs="Calibri"/>
+          <w:sz w:val="22"/>
+          <w:szCs w:val="22"/>
         </w:rPr>
       </w:pPr>
       <w:r>
@@ -32,18 +32,18 @@
       </w:r>
       <w:r>
         <w:rPr>
-          <w:rFonts w:hint="default" w:ascii="Arial" w:hAnsi="Arial" w:cs="Arial"/>
-          <w:sz w:val="24"/>
-          <w:szCs w:val="24"/>
+          <w:rFonts w:hint="default" w:ascii="Calibri" w:hAnsi="Calibri" w:cs="Calibri"/>
+          <w:sz w:val="22"/>
+          <w:szCs w:val="22"/>
           <w:lang w:val="en-US"/>
         </w:rPr>
         <w:t>[[Date]]</w:t>
       </w:r>
       <w:r>
         <w:rPr>
-          <w:rFonts w:hint="default" w:ascii="Arial" w:hAnsi="Arial" w:cs="Arial"/>
-          <w:sz w:val="24"/>
-          <w:szCs w:val="24"/>
+          <w:rFonts w:hint="default" w:ascii="Calibri" w:hAnsi="Calibri" w:cs="Calibri"/>
+          <w:sz w:val="22"/>
+          <w:szCs w:val="22"/>
           <w:lang w:val="en-US"/>
         </w:rPr>
         <w:br w:type="textWrapping"/>
@@ -52,122 +52,122 @@
     <w:p>
       <w:pPr>
         <w:rPr>
-          <w:rFonts w:hint="default" w:ascii="Arial" w:hAnsi="Arial" w:cs="Arial"/>
-          <w:sz w:val="24"/>
-          <w:szCs w:val="24"/>
+          <w:rFonts w:hint="default" w:ascii="Calibri" w:hAnsi="Calibri" w:cs="Calibri"/>
+          <w:sz w:val="22"/>
+          <w:szCs w:val="22"/>
           <w:lang w:val="en-US"/>
         </w:rPr>
       </w:pPr>
       <w:r>
         <w:rPr>
-          <w:rFonts w:hint="default" w:ascii="Arial" w:hAnsi="Arial" w:cs="Arial"/>
-          <w:sz w:val="24"/>
-          <w:szCs w:val="24"/>
+          <w:rFonts w:hint="default" w:ascii="Calibri" w:hAnsi="Calibri" w:cs="Calibri"/>
+          <w:sz w:val="22"/>
+          <w:szCs w:val="22"/>
           <w:lang w:val="en-US"/>
         </w:rPr>
         <w:t>[[Obligee]]</w:t>
       </w:r>
-    </w:p>
-    <w:p>
-      <w:pPr>
-        <w:rPr>
-          <w:rFonts w:hint="default" w:ascii="Arial" w:hAnsi="Arial" w:cs="Arial"/>
-          <w:sz w:val="24"/>
-          <w:szCs w:val="24"/>
-        </w:rPr>
-      </w:pPr>
       <w:r>
         <w:rPr>
-          <w:rFonts w:hint="default" w:ascii="Arial" w:hAnsi="Arial" w:cs="Arial"/>
-          <w:sz w:val="24"/>
-          <w:szCs w:val="24"/>
+          <w:rFonts w:hint="default" w:ascii="Calibri" w:hAnsi="Calibri" w:cs="Calibri"/>
+          <w:sz w:val="22"/>
+          <w:szCs w:val="22"/>
+          <w:lang w:val="en-US"/>
+        </w:rPr>
+        <w:br w:type="textWrapping"/>
+      </w:r>
+      <w:r>
+        <w:rPr>
+          <w:rFonts w:hint="default" w:ascii="Calibri" w:hAnsi="Calibri" w:cs="Calibri"/>
+          <w:sz w:val="22"/>
+          <w:szCs w:val="22"/>
           <w:lang w:val="en-US"/>
         </w:rPr>
         <w:t>[[</w:t>
       </w:r>
       <w:r>
         <w:rPr>
-          <w:rFonts w:hint="default" w:ascii="Arial" w:hAnsi="Arial" w:cs="Arial"/>
-          <w:sz w:val="24"/>
-          <w:szCs w:val="24"/>
+          <w:rFonts w:hint="default" w:ascii="Calibri" w:hAnsi="Calibri" w:cs="Calibri"/>
+          <w:sz w:val="22"/>
+          <w:szCs w:val="22"/>
         </w:rPr>
         <w:t>A</w:t>
       </w:r>
       <w:r>
         <w:rPr>
-          <w:rFonts w:hint="default" w:ascii="Arial" w:hAnsi="Arial" w:cs="Arial"/>
-          <w:sz w:val="24"/>
-          <w:szCs w:val="24"/>
+          <w:rFonts w:hint="default" w:ascii="Calibri" w:hAnsi="Calibri" w:cs="Calibri"/>
+          <w:sz w:val="22"/>
+          <w:szCs w:val="22"/>
           <w:lang w:val="en-US"/>
         </w:rPr>
         <w:t>ddress line 1]]</w:t>
       </w:r>
       <w:r>
         <w:rPr>
-          <w:rFonts w:hint="default" w:ascii="Arial" w:hAnsi="Arial" w:cs="Arial"/>
-          <w:sz w:val="24"/>
-          <w:szCs w:val="24"/>
+          <w:rFonts w:hint="default" w:ascii="Calibri" w:hAnsi="Calibri" w:cs="Calibri"/>
+          <w:sz w:val="22"/>
+          <w:szCs w:val="22"/>
           <w:lang w:val="en-US"/>
         </w:rPr>
         <w:br w:type="textWrapping"/>
       </w:r>
       <w:r>
         <w:rPr>
-          <w:rFonts w:hint="default" w:ascii="Arial" w:hAnsi="Arial" w:cs="Arial"/>
-          <w:sz w:val="24"/>
-          <w:szCs w:val="24"/>
+          <w:rFonts w:hint="default" w:ascii="Calibri" w:hAnsi="Calibri" w:cs="Calibri"/>
+          <w:sz w:val="22"/>
+          <w:szCs w:val="22"/>
           <w:lang w:val="en-US"/>
         </w:rPr>
         <w:t>[[</w:t>
       </w:r>
       <w:r>
         <w:rPr>
-          <w:rFonts w:hint="default" w:ascii="Arial" w:hAnsi="Arial" w:cs="Arial"/>
-          <w:sz w:val="24"/>
-          <w:szCs w:val="24"/>
+          <w:rFonts w:hint="default" w:ascii="Calibri" w:hAnsi="Calibri" w:cs="Calibri"/>
+          <w:sz w:val="22"/>
+          <w:szCs w:val="22"/>
         </w:rPr>
         <w:t>A</w:t>
       </w:r>
       <w:r>
         <w:rPr>
-          <w:rFonts w:hint="default" w:ascii="Arial" w:hAnsi="Arial" w:cs="Arial"/>
-          <w:sz w:val="24"/>
-          <w:szCs w:val="24"/>
+          <w:rFonts w:hint="default" w:ascii="Calibri" w:hAnsi="Calibri" w:cs="Calibri"/>
+          <w:sz w:val="22"/>
+          <w:szCs w:val="22"/>
           <w:lang w:val="en-US"/>
         </w:rPr>
         <w:t>ddress line 2]]</w:t>
       </w:r>
       <w:r>
         <w:rPr>
-          <w:rFonts w:hint="default" w:ascii="Arial" w:hAnsi="Arial" w:cs="Arial"/>
-          <w:sz w:val="24"/>
-          <w:szCs w:val="24"/>
+          <w:rFonts w:hint="default" w:ascii="Calibri" w:hAnsi="Calibri" w:cs="Calibri"/>
+          <w:sz w:val="22"/>
+          <w:szCs w:val="22"/>
           <w:lang w:val="en-US"/>
         </w:rPr>
         <w:br w:type="textWrapping"/>
       </w:r>
       <w:r>
         <w:rPr>
-          <w:rFonts w:hint="default" w:ascii="Arial" w:hAnsi="Arial" w:cs="Arial"/>
-          <w:sz w:val="24"/>
-          <w:szCs w:val="24"/>
+          <w:rFonts w:hint="default" w:ascii="Calibri" w:hAnsi="Calibri" w:cs="Calibri"/>
+          <w:sz w:val="22"/>
+          <w:szCs w:val="22"/>
           <w:lang w:val="en-US"/>
         </w:rPr>
         <w:t>[[</w:t>
       </w:r>
       <w:r>
         <w:rPr>
-          <w:rFonts w:hint="default" w:ascii="Arial" w:hAnsi="Arial" w:cs="Arial"/>
-          <w:sz w:val="24"/>
-          <w:szCs w:val="24"/>
+          <w:rFonts w:hint="default" w:ascii="Calibri" w:hAnsi="Calibri" w:cs="Calibri"/>
+          <w:sz w:val="22"/>
+          <w:szCs w:val="22"/>
         </w:rPr>
         <w:t>A</w:t>
       </w:r>
       <w:r>
         <w:rPr>
-          <w:rFonts w:hint="default" w:ascii="Arial" w:hAnsi="Arial" w:cs="Arial"/>
-          <w:sz w:val="24"/>
-          <w:szCs w:val="24"/>
+          <w:rFonts w:hint="default" w:ascii="Calibri" w:hAnsi="Calibri" w:cs="Calibri"/>
+          <w:sz w:val="22"/>
+          <w:szCs w:val="22"/>
           <w:lang w:val="en-US"/>
         </w:rPr>
         <w:t>ddress line 3]]</w:t>
@@ -175,126 +175,136 @@
     </w:p>
     <w:p>
       <w:pPr>
-        <w:ind w:left="1430" w:hanging="1560" w:hangingChars="650"/>
         <w:rPr>
-          <w:rFonts w:hint="default" w:ascii="Arial" w:hAnsi="Arial" w:cs="Arial"/>
-          <w:sz w:val="24"/>
-          <w:szCs w:val="24"/>
+          <w:rFonts w:hint="default" w:ascii="Calibri" w:hAnsi="Calibri" w:cs="Calibri"/>
+          <w:sz w:val="22"/>
+          <w:szCs w:val="22"/>
+          <w:lang w:val="en-US"/>
+        </w:rPr>
+      </w:pPr>
+    </w:p>
+    <w:p>
+      <w:pPr>
+        <w:ind w:left="1430" w:hanging="1430" w:hangingChars="650"/>
+        <w:rPr>
+          <w:rFonts w:hint="default" w:ascii="Calibri" w:hAnsi="Calibri" w:cs="Calibri"/>
+          <w:sz w:val="22"/>
+          <w:szCs w:val="22"/>
           <w:lang w:val="en-US"/>
         </w:rPr>
       </w:pPr>
       <w:r>
         <w:rPr>
-          <w:rFonts w:hint="default" w:ascii="Arial" w:hAnsi="Arial" w:cs="Arial"/>
-          <w:sz w:val="24"/>
-          <w:szCs w:val="24"/>
+          <w:rFonts w:hint="default" w:ascii="Calibri" w:hAnsi="Calibri" w:cs="Calibri"/>
+          <w:sz w:val="22"/>
+          <w:szCs w:val="22"/>
         </w:rPr>
         <w:t>Re            :</w:t>
       </w:r>
       <w:r>
         <w:rPr>
-          <w:rFonts w:hint="default" w:ascii="Arial" w:hAnsi="Arial" w:cs="Arial"/>
-          <w:sz w:val="24"/>
-          <w:szCs w:val="24"/>
+          <w:rFonts w:hint="default" w:ascii="Calibri" w:hAnsi="Calibri" w:cs="Calibri"/>
+          <w:sz w:val="22"/>
+          <w:szCs w:val="22"/>
           <w:lang w:val="en-US"/>
         </w:rPr>
         <w:tab/>
       </w:r>
       <w:r>
         <w:rPr>
-          <w:rFonts w:hint="default" w:ascii="Arial" w:hAnsi="Arial" w:cs="Arial"/>
-          <w:sz w:val="24"/>
-          <w:szCs w:val="24"/>
+          <w:rFonts w:hint="default" w:ascii="Calibri" w:hAnsi="Calibri" w:cs="Calibri"/>
+          <w:sz w:val="22"/>
+          <w:szCs w:val="22"/>
           <w:lang w:val="en-US"/>
         </w:rPr>
         <w:tab/>
       </w:r>
       <w:r>
         <w:rPr>
-          <w:rFonts w:hint="default" w:ascii="Arial" w:hAnsi="Arial" w:cs="Arial"/>
+          <w:rFonts w:hint="default" w:ascii="Calibri" w:hAnsi="Calibri" w:cs="Calibri"/>
           <w:b/>
           <w:bCs/>
-          <w:sz w:val="24"/>
-          <w:szCs w:val="24"/>
+          <w:sz w:val="22"/>
+          <w:szCs w:val="22"/>
           <w:lang w:val="en-US"/>
         </w:rPr>
         <w:t>[[</w:t>
       </w:r>
       <w:r>
         <w:rPr>
-          <w:rFonts w:hint="default" w:ascii="Arial" w:hAnsi="Arial" w:cs="Arial"/>
+          <w:rFonts w:hint="default" w:ascii="Calibri" w:hAnsi="Calibri" w:cs="Calibri"/>
           <w:b/>
           <w:bCs/>
-          <w:sz w:val="24"/>
-          <w:szCs w:val="24"/>
+          <w:sz w:val="22"/>
+          <w:szCs w:val="22"/>
         </w:rPr>
         <w:t>BOND</w:t>
       </w:r>
       <w:r>
         <w:rPr>
-          <w:rFonts w:hint="default" w:ascii="Arial" w:hAnsi="Arial" w:cs="Arial"/>
+          <w:rFonts w:hint="default" w:ascii="Calibri" w:hAnsi="Calibri" w:cs="Calibri"/>
           <w:b/>
           <w:bCs/>
-          <w:sz w:val="24"/>
-          <w:szCs w:val="24"/>
+          <w:sz w:val="22"/>
+          <w:szCs w:val="22"/>
           <w:lang w:val="en-US"/>
         </w:rPr>
         <w:t>]] [[Endorsement]]</w:t>
       </w:r>
       <w:r>
         <w:rPr>
-          <w:rFonts w:hint="default" w:ascii="Arial" w:hAnsi="Arial" w:cs="Arial"/>
-          <w:sz w:val="24"/>
-          <w:szCs w:val="24"/>
+          <w:rFonts w:hint="default" w:ascii="Calibri" w:hAnsi="Calibri" w:cs="Calibri"/>
+          <w:sz w:val="22"/>
+          <w:szCs w:val="22"/>
           <w:lang w:val="en-US"/>
         </w:rPr>
         <w:br w:type="textWrapping"/>
       </w:r>
       <w:r>
         <w:rPr>
-          <w:rFonts w:hint="default" w:ascii="Arial" w:hAnsi="Arial" w:cs="Arial"/>
-          <w:sz w:val="24"/>
-          <w:szCs w:val="24"/>
+          <w:rFonts w:hint="default" w:ascii="Calibri" w:hAnsi="Calibri" w:cs="Calibri"/>
+          <w:sz w:val="22"/>
+          <w:szCs w:val="22"/>
           <w:lang w:val="en-US"/>
         </w:rPr>
         <w:tab/>
       </w:r>
       <w:r>
         <w:rPr>
-          <w:rFonts w:hint="default" w:ascii="Arial" w:hAnsi="Arial" w:cs="Arial"/>
-          <w:sz w:val="24"/>
-          <w:szCs w:val="24"/>
+          <w:rFonts w:hint="default" w:ascii="Calibri" w:hAnsi="Calibri" w:cs="Calibri"/>
+          <w:sz w:val="22"/>
+          <w:szCs w:val="22"/>
         </w:rPr>
         <w:t xml:space="preserve">Principal: </w:t>
       </w:r>
       <w:r>
         <w:rPr>
-          <w:rFonts w:hint="default" w:ascii="Arial" w:hAnsi="Arial" w:cs="Arial"/>
+          <w:rFonts w:hint="default" w:ascii="Calibri" w:hAnsi="Calibri" w:cs="Calibri"/>
           <w:b/>
           <w:bCs/>
-          <w:sz w:val="24"/>
-          <w:szCs w:val="24"/>
+          <w:sz w:val="22"/>
+          <w:szCs w:val="22"/>
           <w:lang w:val="en-US"/>
         </w:rPr>
         <w:t>[[</w:t>
       </w:r>
       <w:r>
         <w:rPr>
-          <w:rFonts w:hint="default" w:ascii="Arial" w:hAnsi="Arial" w:cs="Arial"/>
+          <w:rFonts w:hint="default" w:ascii="Calibri" w:hAnsi="Calibri" w:cs="Calibri"/>
           <w:b/>
           <w:bCs/>
-          <w:sz w:val="24"/>
-          <w:szCs w:val="24"/>
+          <w:sz w:val="22"/>
+          <w:szCs w:val="22"/>
         </w:rPr>
         <w:t>PRINCIPAL</w:t>
       </w:r>
       <w:r>
         <w:rPr>
-          <w:rFonts w:hint="default" w:ascii="Arial" w:hAnsi="Arial" w:cs="Arial"/>
+          <w:rFonts w:hint="default" w:ascii="Calibri" w:hAnsi="Calibri" w:cs="Calibri"/>
           <w:b/>
           <w:bCs/>
-          <w:sz w:val="24"/>
-          <w:szCs w:val="24"/>
+          <w:sz w:val="22"/>
+          <w:szCs w:val="22"/>
           <w:lang w:val="en-US"/>
         </w:rPr>
         <w:t>]]</w:t>
@@ -303,226 +313,225 @@
     <w:p>
       <w:pPr>
         <w:rPr>
-          <w:rFonts w:hint="default" w:ascii="Arial" w:hAnsi="Arial" w:cs="Arial"/>
-          <w:sz w:val="24"/>
-          <w:szCs w:val="24"/>
+          <w:rFonts w:hint="default" w:ascii="Calibri" w:hAnsi="Calibri" w:cs="Calibri"/>
+          <w:sz w:val="22"/>
+          <w:szCs w:val="22"/>
         </w:rPr>
       </w:pPr>
       <w:r>
         <w:rPr>
-          <w:rFonts w:hint="default" w:ascii="Arial" w:hAnsi="Arial" w:cs="Arial"/>
-          <w:sz w:val="24"/>
-          <w:szCs w:val="24"/>
+          <w:rFonts w:hint="default" w:ascii="Calibri" w:hAnsi="Calibri" w:cs="Calibri"/>
+          <w:sz w:val="22"/>
+          <w:szCs w:val="22"/>
         </w:rPr>
         <w:t>Gentlemen:</w:t>
       </w:r>
     </w:p>
     <w:p>
       <w:pPr>
+        <w:jc w:val="both"/>
         <w:rPr>
-          <w:rFonts w:hint="default" w:ascii="Arial" w:hAnsi="Arial" w:cs="Arial"/>
-          <w:sz w:val="24"/>
-          <w:szCs w:val="24"/>
+          <w:rFonts w:hint="default" w:ascii="Calibri" w:hAnsi="Calibri" w:cs="Calibri"/>
+          <w:sz w:val="22"/>
+          <w:szCs w:val="22"/>
         </w:rPr>
       </w:pPr>
       <w:r>
         <w:rPr>
-          <w:rFonts w:hint="default" w:ascii="Arial" w:hAnsi="Arial" w:cs="Arial"/>
-          <w:sz w:val="24"/>
-          <w:szCs w:val="24"/>
+          <w:rFonts w:hint="default" w:ascii="Calibri" w:hAnsi="Calibri" w:cs="Calibri"/>
+          <w:sz w:val="22"/>
+          <w:szCs w:val="22"/>
         </w:rPr>
         <w:t xml:space="preserve">This is to confirm that the captioned </w:t>
       </w:r>
       <w:r>
         <w:rPr>
-          <w:rFonts w:hint="default" w:ascii="Arial" w:hAnsi="Arial" w:cs="Arial"/>
+          <w:rFonts w:hint="default" w:ascii="Calibri" w:hAnsi="Calibri" w:cs="Calibri"/>
           <w:b/>
           <w:bCs/>
-          <w:sz w:val="24"/>
-          <w:szCs w:val="24"/>
+          <w:sz w:val="22"/>
+          <w:szCs w:val="22"/>
           <w:lang w:val="en-US"/>
         </w:rPr>
         <w:t>[[</w:t>
       </w:r>
       <w:r>
         <w:rPr>
-          <w:rFonts w:hint="default" w:ascii="Arial" w:hAnsi="Arial" w:cs="Arial"/>
+          <w:rFonts w:hint="default" w:ascii="Calibri" w:hAnsi="Calibri" w:cs="Calibri"/>
           <w:b/>
           <w:bCs/>
-          <w:sz w:val="24"/>
-          <w:szCs w:val="24"/>
+          <w:sz w:val="22"/>
+          <w:szCs w:val="22"/>
         </w:rPr>
         <w:t>B</w:t>
       </w:r>
       <w:r>
         <w:rPr>
-          <w:rFonts w:hint="default" w:ascii="Arial" w:hAnsi="Arial" w:cs="Arial"/>
+          <w:rFonts w:hint="default" w:ascii="Calibri" w:hAnsi="Calibri" w:cs="Calibri"/>
           <w:b/>
           <w:bCs/>
-          <w:sz w:val="24"/>
-          <w:szCs w:val="24"/>
+          <w:sz w:val="22"/>
+          <w:szCs w:val="22"/>
           <w:lang w:val="en-US"/>
         </w:rPr>
         <w:t>ond]]</w:t>
       </w:r>
       <w:r>
         <w:rPr>
-          <w:rFonts w:hint="default" w:ascii="Arial" w:hAnsi="Arial" w:cs="Arial"/>
-          <w:sz w:val="24"/>
-          <w:szCs w:val="24"/>
+          <w:rFonts w:hint="default" w:ascii="Calibri" w:hAnsi="Calibri" w:cs="Calibri"/>
+          <w:sz w:val="22"/>
+          <w:szCs w:val="22"/>
         </w:rPr>
         <w:t xml:space="preserve"> </w:t>
       </w:r>
       <w:r>
         <w:rPr>
-          <w:rFonts w:hint="default" w:ascii="Arial" w:hAnsi="Arial" w:cs="Arial"/>
+          <w:rFonts w:hint="default" w:ascii="Calibri" w:hAnsi="Calibri" w:cs="Calibri"/>
           <w:b/>
           <w:bCs/>
-          <w:sz w:val="24"/>
-          <w:szCs w:val="24"/>
+          <w:sz w:val="22"/>
+          <w:szCs w:val="22"/>
           <w:lang w:val="en-US"/>
         </w:rPr>
         <w:t xml:space="preserve">[[Endorsement]] </w:t>
       </w:r>
-      <w:bookmarkStart w:id="0" w:name="_GoBack"/>
-      <w:bookmarkEnd w:id="0"/>
       <w:r>
         <w:rPr>
-          <w:rFonts w:hint="default" w:ascii="Arial" w:hAnsi="Arial" w:cs="Arial"/>
-          <w:sz w:val="24"/>
-          <w:szCs w:val="24"/>
+          <w:rFonts w:hint="default" w:ascii="Calibri" w:hAnsi="Calibri" w:cs="Calibri"/>
+          <w:sz w:val="22"/>
+          <w:szCs w:val="22"/>
         </w:rPr>
         <w:t xml:space="preserve">issued by our company, STERLING INSURANCE COMPANY, INC., on the </w:t>
       </w:r>
       <w:r>
         <w:rPr>
-          <w:rFonts w:hint="default" w:ascii="Arial" w:hAnsi="Arial" w:cs="Arial"/>
+          <w:rFonts w:hint="default" w:ascii="Calibri" w:hAnsi="Calibri" w:cs="Calibri"/>
           <w:b/>
           <w:bCs/>
-          <w:sz w:val="24"/>
-          <w:szCs w:val="24"/>
+          <w:sz w:val="22"/>
+          <w:szCs w:val="22"/>
           <w:lang w:val="en-US"/>
         </w:rPr>
         <w:t>[[Date issued in words]]</w:t>
       </w:r>
       <w:r>
         <w:rPr>
-          <w:rFonts w:hint="default" w:ascii="Arial" w:hAnsi="Arial" w:cs="Arial"/>
-          <w:sz w:val="24"/>
-          <w:szCs w:val="24"/>
+          <w:rFonts w:hint="default" w:ascii="Calibri" w:hAnsi="Calibri" w:cs="Calibri"/>
+          <w:sz w:val="22"/>
+          <w:szCs w:val="22"/>
         </w:rPr>
         <w:t xml:space="preserve"> in the amount of</w:t>
       </w:r>
       <w:r>
         <w:rPr>
-          <w:rFonts w:hint="default" w:ascii="Arial" w:hAnsi="Arial" w:cs="Arial"/>
-          <w:sz w:val="24"/>
-          <w:szCs w:val="24"/>
+          <w:rFonts w:hint="default" w:ascii="Calibri" w:hAnsi="Calibri" w:cs="Calibri"/>
+          <w:sz w:val="22"/>
+          <w:szCs w:val="22"/>
           <w:lang w:val="en-US"/>
         </w:rPr>
         <w:t xml:space="preserve"> </w:t>
       </w:r>
       <w:r>
         <w:rPr>
-          <w:rFonts w:hint="default" w:ascii="Arial" w:hAnsi="Arial" w:cs="Arial"/>
-          <w:sz w:val="24"/>
-          <w:szCs w:val="24"/>
+          <w:rFonts w:hint="default" w:ascii="Calibri" w:hAnsi="Calibri" w:cs="Calibri"/>
+          <w:sz w:val="22"/>
+          <w:szCs w:val="22"/>
         </w:rPr>
         <w:t xml:space="preserve">PESOS: </w:t>
       </w:r>
       <w:r>
         <w:rPr>
-          <w:rFonts w:hint="default" w:ascii="Arial" w:hAnsi="Arial" w:cs="Arial"/>
+          <w:rFonts w:hint="default" w:ascii="Calibri" w:hAnsi="Calibri" w:cs="Calibri"/>
           <w:b/>
           <w:bCs/>
-          <w:sz w:val="24"/>
-          <w:szCs w:val="24"/>
+          <w:sz w:val="22"/>
+          <w:szCs w:val="22"/>
           <w:lang w:val="en-US"/>
         </w:rPr>
         <w:t>[[</w:t>
       </w:r>
       <w:r>
         <w:rPr>
-          <w:rFonts w:hint="default" w:ascii="Arial" w:hAnsi="Arial" w:cs="Arial"/>
+          <w:rFonts w:hint="default" w:ascii="Calibri" w:hAnsi="Calibri" w:cs="Calibri"/>
           <w:b/>
           <w:bCs/>
-          <w:sz w:val="24"/>
-          <w:szCs w:val="24"/>
+          <w:sz w:val="22"/>
+          <w:szCs w:val="22"/>
         </w:rPr>
         <w:t>A</w:t>
       </w:r>
       <w:r>
         <w:rPr>
-          <w:rFonts w:hint="default" w:ascii="Arial" w:hAnsi="Arial" w:cs="Arial"/>
+          <w:rFonts w:hint="default" w:ascii="Calibri" w:hAnsi="Calibri" w:cs="Calibri"/>
           <w:b/>
           <w:bCs/>
-          <w:sz w:val="24"/>
-          <w:szCs w:val="24"/>
+          <w:sz w:val="22"/>
+          <w:szCs w:val="22"/>
           <w:lang w:val="en-US"/>
         </w:rPr>
         <w:t>mount in words]]</w:t>
       </w:r>
       <w:r>
         <w:rPr>
-          <w:rFonts w:hint="default" w:ascii="Arial" w:hAnsi="Arial" w:cs="Arial"/>
-          <w:sz w:val="24"/>
-          <w:szCs w:val="24"/>
+          <w:rFonts w:hint="default" w:ascii="Calibri" w:hAnsi="Calibri" w:cs="Calibri"/>
+          <w:sz w:val="22"/>
+          <w:szCs w:val="22"/>
           <w:lang w:val="en-US"/>
         </w:rPr>
         <w:t xml:space="preserve"> </w:t>
       </w:r>
       <w:r>
         <w:rPr>
-          <w:rFonts w:hint="default" w:ascii="Arial" w:hAnsi="Arial" w:cs="Arial"/>
+          <w:rFonts w:hint="default" w:ascii="Calibri" w:hAnsi="Calibri" w:cs="Calibri"/>
           <w:b/>
           <w:bCs/>
-          <w:sz w:val="24"/>
-          <w:szCs w:val="24"/>
+          <w:sz w:val="22"/>
+          <w:szCs w:val="22"/>
           <w:lang w:val="en-US"/>
         </w:rPr>
         <w:t>([[Amount]])</w:t>
       </w:r>
       <w:r>
         <w:rPr>
-          <w:rFonts w:hint="default" w:ascii="Arial" w:hAnsi="Arial" w:cs="Arial"/>
-          <w:sz w:val="24"/>
-          <w:szCs w:val="24"/>
+          <w:rFonts w:hint="default" w:ascii="Calibri" w:hAnsi="Calibri" w:cs="Calibri"/>
+          <w:sz w:val="22"/>
+          <w:szCs w:val="22"/>
         </w:rPr>
         <w:t>, Philippine Currency, in connection with the “</w:t>
       </w:r>
       <w:r>
         <w:rPr>
-          <w:rFonts w:hint="default" w:ascii="Arial" w:hAnsi="Arial" w:cs="Arial"/>
+          <w:rFonts w:hint="default" w:ascii="Calibri" w:hAnsi="Calibri" w:cs="Calibri"/>
           <w:b/>
           <w:bCs/>
-          <w:sz w:val="24"/>
-          <w:szCs w:val="24"/>
+          <w:sz w:val="22"/>
+          <w:szCs w:val="22"/>
           <w:lang w:val="en-US"/>
         </w:rPr>
         <w:t>[[Project name]]</w:t>
       </w:r>
       <w:r>
         <w:rPr>
-          <w:rFonts w:hint="default" w:ascii="Arial" w:hAnsi="Arial" w:cs="Arial"/>
-          <w:sz w:val="24"/>
-          <w:szCs w:val="24"/>
+          <w:rFonts w:hint="default" w:ascii="Calibri" w:hAnsi="Calibri" w:cs="Calibri"/>
+          <w:sz w:val="22"/>
+          <w:szCs w:val="22"/>
           <w:lang w:val="en-US"/>
         </w:rPr>
         <w:t>”, of which the coverage period is from [[Date issued]] - [[Expiry date]]</w:t>
       </w:r>
       <w:r>
         <w:rPr>
-          <w:rFonts w:hint="default" w:ascii="Arial" w:hAnsi="Arial" w:cs="Arial"/>
-          <w:sz w:val="24"/>
-          <w:szCs w:val="24"/>
+          <w:rFonts w:hint="default" w:ascii="Calibri" w:hAnsi="Calibri" w:cs="Calibri"/>
+          <w:sz w:val="22"/>
+          <w:szCs w:val="22"/>
         </w:rPr>
         <w:t xml:space="preserve"> is valid, genuine and authentic.</w:t>
       </w:r>
       <w:r>
         <w:rPr>
-          <w:rFonts w:hint="default" w:ascii="Arial" w:hAnsi="Arial" w:cs="Arial"/>
-          <w:sz w:val="24"/>
-          <w:szCs w:val="24"/>
+          <w:rFonts w:hint="default" w:ascii="Calibri" w:hAnsi="Calibri" w:cs="Calibri"/>
+          <w:sz w:val="22"/>
+          <w:szCs w:val="22"/>
         </w:rPr>
         <w:br w:type="textWrapping"/>
       </w:r>
@@ -530,16 +539,16 @@
     <w:p>
       <w:pPr>
         <w:rPr>
-          <w:rFonts w:hint="default" w:ascii="Arial" w:hAnsi="Arial" w:cs="Arial"/>
-          <w:sz w:val="24"/>
-          <w:szCs w:val="24"/>
+          <w:rFonts w:hint="default" w:ascii="Calibri" w:hAnsi="Calibri" w:cs="Calibri"/>
+          <w:sz w:val="22"/>
+          <w:szCs w:val="22"/>
         </w:rPr>
       </w:pPr>
       <w:r>
         <w:rPr>
-          <w:rFonts w:hint="default" w:ascii="Arial" w:hAnsi="Arial" w:cs="Arial"/>
-          <w:sz w:val="24"/>
-          <w:szCs w:val="24"/>
+          <w:rFonts w:hint="default" w:ascii="Calibri" w:hAnsi="Calibri" w:cs="Calibri"/>
+          <w:sz w:val="22"/>
+          <w:szCs w:val="22"/>
         </w:rPr>
         <w:t>Very truly yours,</w:t>
       </w:r>
@@ -547,17 +556,17 @@
     <w:p>
       <w:pPr>
         <w:rPr>
-          <w:rFonts w:hint="default" w:ascii="Arial" w:hAnsi="Arial" w:cs="Arial"/>
-          <w:sz w:val="24"/>
-          <w:szCs w:val="24"/>
+          <w:rFonts w:hint="default" w:ascii="Calibri" w:hAnsi="Calibri" w:cs="Calibri"/>
+          <w:sz w:val="22"/>
+          <w:szCs w:val="22"/>
           <w:lang w:val="en-US"/>
         </w:rPr>
       </w:pPr>
       <w:r>
         <w:rPr>
-          <w:rFonts w:hint="default" w:ascii="Arial" w:hAnsi="Arial" w:cs="Arial"/>
-          <w:sz w:val="24"/>
-          <w:szCs w:val="24"/>
+          <w:rFonts w:hint="default" w:ascii="Calibri" w:hAnsi="Calibri" w:cs="Calibri"/>
+          <w:sz w:val="22"/>
+          <w:szCs w:val="22"/>
           <w:lang w:val="en-US"/>
         </w:rPr>
         <w:t>[[Signature]]</w:t>
@@ -566,15 +575,89 @@
     <w:p>
       <w:pPr>
         <w:rPr>
-          <w:rFonts w:hint="default" w:ascii="Arial" w:hAnsi="Arial" w:cs="Arial"/>
-          <w:sz w:val="24"/>
-          <w:szCs w:val="24"/>
+          <w:rFonts w:hint="default" w:ascii="Calibri" w:hAnsi="Calibri" w:cs="Calibri"/>
+          <w:sz w:val="22"/>
+          <w:szCs w:val="22"/>
           <w:lang w:val="en-US"/>
         </w:rPr>
       </w:pPr>
       <w:r>
         <w:rPr>
-          <w:sz w:val="24"/>
+          <w:rFonts w:hint="default" w:ascii="Calibri" w:hAnsi="Calibri" w:cs="Calibri"/>
+          <w:sz w:val="22"/>
+          <w:szCs w:val="22"/>
+          <w:lang w:val="en-US"/>
+        </w:rPr>
+        <w:t>[[Signatory]]</w:t>
+      </w:r>
+      <w:r>
+        <w:rPr>
+          <w:rFonts w:hint="default" w:ascii="Calibri" w:hAnsi="Calibri" w:cs="Calibri"/>
+          <w:sz w:val="22"/>
+          <w:szCs w:val="22"/>
+        </w:rPr>
+        <w:br w:type="textWrapping"/>
+      </w:r>
+      <w:r>
+        <w:rPr>
+          <w:rFonts w:hint="default" w:ascii="Calibri" w:hAnsi="Calibri" w:cs="Calibri"/>
+          <w:sz w:val="22"/>
+          <w:szCs w:val="22"/>
+          <w:lang w:val="en-US"/>
+        </w:rPr>
+        <w:t>[[Position]]</w:t>
+      </w:r>
+      <w:r>
+        <w:rPr>
+          <w:rFonts w:hint="default" w:ascii="Calibri" w:hAnsi="Calibri" w:cs="Calibri"/>
+          <w:sz w:val="22"/>
+          <w:szCs w:val="22"/>
+          <w:lang w:val="en-US"/>
+        </w:rPr>
+        <w:br w:type="textWrapping"/>
+      </w:r>
+      <w:r>
+        <w:rPr>
+          <w:rFonts w:hint="default" w:ascii="Calibri" w:hAnsi="Calibri" w:cs="Calibri"/>
+          <w:sz w:val="22"/>
+          <w:szCs w:val="22"/>
+          <w:lang w:val="en-US"/>
+        </w:rPr>
+        <w:tab/>
+      </w:r>
+      <w:r>
+        <w:rPr>
+          <w:rFonts w:hint="default" w:ascii="Calibri" w:hAnsi="Calibri" w:cs="Calibri"/>
+          <w:sz w:val="22"/>
+          <w:szCs w:val="22"/>
+          <w:lang w:val="en-US"/>
+        </w:rPr>
+        <w:br w:type="textWrapping"/>
+      </w:r>
+      <w:r>
+        <w:rPr>
+          <w:rFonts w:hint="default" w:ascii="Calibri" w:hAnsi="Calibri" w:cs="Calibri"/>
+          <w:sz w:val="22"/>
+          <w:szCs w:val="22"/>
+          <w:lang w:val="en-US"/>
+        </w:rPr>
+        <w:t>[[Jurat]]</w:t>
+      </w:r>
+    </w:p>
+    <w:p>
+      <w:pPr>
+        <w:rPr>
+          <w:rFonts w:hint="default" w:ascii="Calibri" w:hAnsi="Calibri" w:cs="Calibri"/>
+          <w:sz w:val="22"/>
+          <w:szCs w:val="22"/>
+          <w:lang w:val="en-US"/>
+        </w:rPr>
+      </w:pPr>
+      <w:r>
+        <w:rPr>
+          <w:rFonts w:hint="default" w:ascii="Calibri" w:hAnsi="Calibri" w:cs="Calibri"/>
+          <w:sz w:val="22"/>
+          <w:szCs w:val="22"/>
         </w:rPr>
         <mc:AlternateContent>
           <mc:Choice Requires="wps">
@@ -582,19 +665,19 @@
               <wp:anchor distT="0" distB="0" distL="114300" distR="114300" simplePos="0" relativeHeight="251659264" behindDoc="1" locked="0" layoutInCell="1" allowOverlap="1">
                 <wp:simplePos x="0" y="0"/>
                 <wp:positionH relativeFrom="column">
-                  <wp:posOffset>4005580</wp:posOffset>
+                  <wp:posOffset>3119755</wp:posOffset>
                 </wp:positionH>
                 <wp:positionV relativeFrom="paragraph">
-                  <wp:posOffset>1532255</wp:posOffset>
+                  <wp:posOffset>342265</wp:posOffset>
                 </wp:positionV>
-                <wp:extent cx="838200" cy="266065"/>
-                <wp:effectExtent l="0" t="0" r="0" b="635"/>
+                <wp:extent cx="1913890" cy="1275715"/>
+                <wp:effectExtent l="0" t="0" r="0" b="0"/>
                 <wp:wrapTight wrapText="bothSides">
                   <wp:wrapPolygon>
                     <wp:start x="0" y="0"/>
-                    <wp:lineTo x="0" y="20105"/>
-                    <wp:lineTo x="21109" y="20105"/>
-                    <wp:lineTo x="21109" y="0"/>
+                    <wp:lineTo x="0" y="21288"/>
+                    <wp:lineTo x="21285" y="21288"/>
+                    <wp:lineTo x="21285" y="0"/>
                     <wp:lineTo x="0" y="0"/>
                   </wp:wrapPolygon>
                 </wp:wrapTight>
@@ -607,7 +690,7 @@
                       <wps:spPr>
                         <a:xfrm>
                           <a:off x="5120005" y="7127875"/>
-                          <a:ext cx="838200" cy="266065"/>
+                          <a:ext cx="1913890" cy="1275715"/>
                         </a:xfrm>
                         <a:prstGeom prst="rect">
                           <a:avLst/>
@@ -640,22 +723,16 @@
                               <w:jc w:val="center"/>
                               <w:rPr>
                                 <w:rFonts w:hint="default" w:ascii="Arial" w:hAnsi="Arial" w:cs="Arial"/>
-                                <w:sz w:val="24"/>
-                                <w:szCs w:val="24"/>
+                                <w:sz w:val="28"/>
+                                <w:szCs w:val="28"/>
                                 <w:lang w:val="en-US"/>
-                                <w14:textOutline w14:w="9525">
-                                  <w14:solidFill>
-                                    <w14:srgbClr w14:val="000000"/>
-                                  </w14:solidFill>
-                                  <w14:round/>
-                                </w14:textOutline>
                               </w:rPr>
                             </w:pPr>
                             <w:r>
                               <w:rPr>
                                 <w:rFonts w:hint="default" w:ascii="Arial" w:hAnsi="Arial" w:cs="Arial"/>
-                                <w:sz w:val="24"/>
-                                <w:szCs w:val="24"/>
+                                <w:sz w:val="28"/>
+                                <w:szCs w:val="28"/>
                                 <w:lang w:val="en-US"/>
                               </w:rPr>
                               <w:t>[[Notary]]</w:t>
@@ -674,7 +751,7 @@
           </mc:Choice>
           <mc:Fallback>
             <w:pict>
-              <v:shape id="_x0000_s1026" o:spid="_x0000_s1026" o:spt="202" type="#_x0000_t202" style="position:absolute;left:0pt;margin-left:315.4pt;margin-top:120.65pt;height:20.95pt;width:66pt;mso-wrap-distance-left:9pt;mso-wrap-distance-right:9pt;z-index:-251657216;mso-width-relative:page;mso-height-relative:page;" fillcolor="#FFFFFF [3201]" filled="t" stroked="f" coordsize="21600,21600" wrapcoords="0 0 0 20105 21109 20105 21109 0 0 0" o:gfxdata="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">
+              <v:shape id="_x0000_s1026" o:spid="_x0000_s1026" o:spt="202" type="#_x0000_t202" style="position:absolute;left:0pt;margin-left:245.65pt;margin-top:26.95pt;height:100.45pt;width:150.7pt;mso-wrap-distance-left:9pt;mso-wrap-distance-right:9pt;z-index:-251657216;mso-width-relative:page;mso-height-relative:page;" fillcolor="#FFFFFF [3201]" filled="t" stroked="f" coordsize="21600,21600" wrapcoords="0 0 0 21288 21285 21288 21285 0 0 0" o:gfxdata="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">
                 <v:fill on="t" focussize="0,0"/>
                 <v:stroke on="f" weight="0.5pt"/>
                 <v:imagedata o:title=""/>
@@ -686,22 +763,16 @@
                         <w:jc w:val="center"/>
                         <w:rPr>
                           <w:rFonts w:hint="default" w:ascii="Arial" w:hAnsi="Arial" w:cs="Arial"/>
-                          <w:sz w:val="24"/>
-                          <w:szCs w:val="24"/>
+                          <w:sz w:val="28"/>
+                          <w:szCs w:val="28"/>
                           <w:lang w:val="en-US"/>
-                          <w14:textOutline w14:w="9525">
-                            <w14:solidFill>
-                              <w14:srgbClr w14:val="000000"/>
-                            </w14:solidFill>
-                            <w14:round/>
-                          </w14:textOutline>
                         </w:rPr>
                       </w:pPr>
                       <w:r>
                         <w:rPr>
                           <w:rFonts w:hint="default" w:ascii="Arial" w:hAnsi="Arial" w:cs="Arial"/>
-                          <w:sz w:val="24"/>
-                          <w:szCs w:val="24"/>
+                          <w:sz w:val="28"/>
+                          <w:szCs w:val="28"/>
                           <w:lang w:val="en-US"/>
                         </w:rPr>
                         <w:t>[[Notary]]</w:t>
@@ -717,77 +788,9 @@
       </w:r>
       <w:r>
         <w:rPr>
-          <w:rFonts w:hint="default" w:ascii="Arial" w:hAnsi="Arial" w:cs="Arial"/>
-          <w:sz w:val="24"/>
-          <w:szCs w:val="24"/>
-          <w:lang w:val="en-US"/>
-        </w:rPr>
-        <w:t>[[Signatory]]</w:t>
-      </w:r>
-      <w:r>
-        <w:rPr>
-          <w:rFonts w:hint="default" w:ascii="Arial" w:hAnsi="Arial" w:cs="Arial"/>
-          <w:sz w:val="24"/>
-          <w:szCs w:val="24"/>
-        </w:rPr>
-        <w:br w:type="textWrapping"/>
-      </w:r>
-      <w:r>
-        <w:rPr>
-          <w:rFonts w:hint="default" w:ascii="Arial" w:hAnsi="Arial" w:cs="Arial"/>
-          <w:sz w:val="24"/>
-          <w:szCs w:val="24"/>
-          <w:lang w:val="en-US"/>
-        </w:rPr>
-        <w:t>[[Position]]</w:t>
-      </w:r>
-      <w:r>
-        <w:rPr>
-          <w:rFonts w:hint="default" w:ascii="Arial" w:hAnsi="Arial" w:cs="Arial"/>
-          <w:sz w:val="24"/>
-          <w:szCs w:val="24"/>
-          <w:lang w:val="en-US"/>
-        </w:rPr>
-        <w:br w:type="textWrapping"/>
-      </w:r>
-      <w:r>
-        <w:rPr>
-          <w:rFonts w:hint="default" w:ascii="Arial" w:hAnsi="Arial" w:cs="Arial"/>
-          <w:sz w:val="24"/>
-          <w:szCs w:val="24"/>
-          <w:lang w:val="en-US"/>
-        </w:rPr>
-        <w:tab/>
-      </w:r>
-      <w:r>
-        <w:rPr>
-          <w:rFonts w:hint="default" w:ascii="Arial" w:hAnsi="Arial" w:cs="Arial"/>
-          <w:sz w:val="24"/>
-          <w:szCs w:val="24"/>
-          <w:lang w:val="en-US"/>
-        </w:rPr>
-        <w:br w:type="textWrapping"/>
-      </w:r>
-      <w:r>
-        <w:rPr>
-          <w:rFonts w:hint="default" w:ascii="Arial" w:hAnsi="Arial" w:cs="Arial"/>
-          <w:sz w:val="24"/>
-          <w:szCs w:val="24"/>
-          <w:lang w:val="en-US"/>
-        </w:rPr>
-        <w:t>[[Jurat]]</w:t>
-      </w:r>
-    </w:p>
-    <w:p>
-      <w:pPr>
-        <w:rPr>
-          <w:rFonts w:hint="default"/>
-          <w:lang w:val="en-US"/>
-        </w:rPr>
-      </w:pPr>
-      <w:r>
-        <w:rPr>
-          <w:sz w:val="24"/>
+          <w:rFonts w:hint="default" w:ascii="Calibri" w:hAnsi="Calibri" w:cs="Calibri"/>
+          <w:sz w:val="22"/>
+          <w:szCs w:val="22"/>
         </w:rPr>
         <mc:AlternateContent>
           <mc:Choice Requires="wps">
@@ -907,7 +910,9 @@
       </w:r>
       <w:r>
         <w:rPr>
-          <w:sz w:val="24"/>
+          <w:rFonts w:hint="default" w:ascii="Calibri" w:hAnsi="Calibri" w:cs="Calibri"/>
+          <w:sz w:val="22"/>
+          <w:szCs w:val="22"/>
         </w:rPr>
         <mc:AlternateContent>
           <mc:Choice Requires="wps">
@@ -1027,137 +1032,139 @@
       </w:r>
       <w:r>
         <w:rPr>
-          <w:rFonts w:hint="default" w:ascii="Arial" w:hAnsi="Arial" w:cs="Arial"/>
-          <w:sz w:val="24"/>
-          <w:szCs w:val="24"/>
+          <w:rFonts w:hint="default" w:ascii="Calibri" w:hAnsi="Calibri" w:cs="Calibri"/>
+          <w:sz w:val="22"/>
+          <w:szCs w:val="22"/>
         </w:rPr>
         <w:br w:type="textWrapping"/>
       </w:r>
       <w:r>
         <w:rPr>
-          <w:rFonts w:hint="default" w:ascii="Arial" w:hAnsi="Arial" w:cs="Arial"/>
-          <w:sz w:val="24"/>
-          <w:szCs w:val="24"/>
+          <w:rFonts w:hint="default" w:ascii="Calibri" w:hAnsi="Calibri" w:cs="Calibri"/>
+          <w:sz w:val="22"/>
+          <w:szCs w:val="22"/>
         </w:rPr>
         <w:t xml:space="preserve">Doc. No.    </w:t>
       </w:r>
       <w:r>
         <w:rPr>
-          <w:rFonts w:hint="default" w:ascii="Arial" w:hAnsi="Arial" w:cs="Arial"/>
-          <w:sz w:val="24"/>
-          <w:szCs w:val="24"/>
+          <w:rFonts w:hint="default" w:ascii="Calibri" w:hAnsi="Calibri" w:cs="Calibri"/>
+          <w:sz w:val="22"/>
+          <w:szCs w:val="22"/>
           <w:lang w:val="en-US"/>
         </w:rPr>
         <w:t>[[</w:t>
       </w:r>
       <w:r>
         <w:rPr>
-          <w:rFonts w:hint="default" w:ascii="Arial" w:hAnsi="Arial" w:cs="Arial"/>
-          <w:sz w:val="24"/>
-          <w:szCs w:val="24"/>
+          <w:rFonts w:hint="default" w:ascii="Calibri" w:hAnsi="Calibri" w:cs="Calibri"/>
+          <w:sz w:val="22"/>
+          <w:szCs w:val="22"/>
         </w:rPr>
         <w:t>Doc. No.</w:t>
       </w:r>
       <w:r>
         <w:rPr>
-          <w:rFonts w:hint="default" w:ascii="Arial" w:hAnsi="Arial" w:cs="Arial"/>
-          <w:sz w:val="24"/>
-          <w:szCs w:val="24"/>
+          <w:rFonts w:hint="default" w:ascii="Calibri" w:hAnsi="Calibri" w:cs="Calibri"/>
+          <w:sz w:val="22"/>
+          <w:szCs w:val="22"/>
           <w:lang w:val="en-US"/>
         </w:rPr>
         <w:t>]]</w:t>
       </w:r>
+      <w:bookmarkStart w:id="0" w:name="_GoBack"/>
+      <w:bookmarkEnd w:id="0"/>
       <w:r>
         <w:rPr>
-          <w:rFonts w:hint="default" w:ascii="Arial" w:hAnsi="Arial" w:cs="Arial"/>
-          <w:sz w:val="24"/>
-          <w:szCs w:val="24"/>
+          <w:rFonts w:hint="default" w:ascii="Calibri" w:hAnsi="Calibri" w:cs="Calibri"/>
+          <w:sz w:val="22"/>
+          <w:szCs w:val="22"/>
           <w:lang w:val="en-US"/>
         </w:rPr>
         <w:br w:type="textWrapping"/>
       </w:r>
       <w:r>
         <w:rPr>
-          <w:rFonts w:hint="default" w:ascii="Arial" w:hAnsi="Arial" w:cs="Arial"/>
-          <w:sz w:val="24"/>
-          <w:szCs w:val="24"/>
+          <w:rFonts w:hint="default" w:ascii="Calibri" w:hAnsi="Calibri" w:cs="Calibri"/>
+          <w:sz w:val="22"/>
+          <w:szCs w:val="22"/>
         </w:rPr>
         <w:t xml:space="preserve">Page No.   </w:t>
       </w:r>
       <w:r>
         <w:rPr>
-          <w:rFonts w:hint="default" w:ascii="Arial" w:hAnsi="Arial" w:cs="Arial"/>
-          <w:sz w:val="24"/>
-          <w:szCs w:val="24"/>
+          <w:rFonts w:hint="default" w:ascii="Calibri" w:hAnsi="Calibri" w:cs="Calibri"/>
+          <w:sz w:val="22"/>
+          <w:szCs w:val="22"/>
           <w:lang w:val="en-US"/>
         </w:rPr>
         <w:t>[[</w:t>
       </w:r>
       <w:r>
         <w:rPr>
-          <w:rFonts w:hint="default" w:ascii="Arial" w:hAnsi="Arial" w:cs="Arial"/>
-          <w:sz w:val="24"/>
-          <w:szCs w:val="24"/>
+          <w:rFonts w:hint="default" w:ascii="Calibri" w:hAnsi="Calibri" w:cs="Calibri"/>
+          <w:sz w:val="22"/>
+          <w:szCs w:val="22"/>
         </w:rPr>
         <w:t>Page No.</w:t>
       </w:r>
       <w:r>
         <w:rPr>
-          <w:rFonts w:hint="default" w:ascii="Arial" w:hAnsi="Arial" w:cs="Arial"/>
-          <w:sz w:val="24"/>
-          <w:szCs w:val="24"/>
+          <w:rFonts w:hint="default" w:ascii="Calibri" w:hAnsi="Calibri" w:cs="Calibri"/>
+          <w:sz w:val="22"/>
+          <w:szCs w:val="22"/>
           <w:lang w:val="en-US"/>
         </w:rPr>
         <w:t xml:space="preserve">]]        </w:t>
       </w:r>
       <w:r>
         <w:rPr>
-          <w:rFonts w:hint="default" w:ascii="Arial" w:hAnsi="Arial" w:cs="Arial"/>
-          <w:sz w:val="24"/>
-          <w:szCs w:val="24"/>
+          <w:rFonts w:hint="default" w:ascii="Calibri" w:hAnsi="Calibri" w:cs="Calibri"/>
+          <w:sz w:val="22"/>
+          <w:szCs w:val="22"/>
           <w:lang w:val="en-US"/>
         </w:rPr>
         <w:br w:type="textWrapping"/>
       </w:r>
       <w:r>
         <w:rPr>
-          <w:rFonts w:hint="default" w:ascii="Arial" w:hAnsi="Arial" w:cs="Arial"/>
-          <w:sz w:val="24"/>
-          <w:szCs w:val="24"/>
+          <w:rFonts w:hint="default" w:ascii="Calibri" w:hAnsi="Calibri" w:cs="Calibri"/>
+          <w:sz w:val="22"/>
+          <w:szCs w:val="22"/>
         </w:rPr>
         <w:t xml:space="preserve">Book No.   </w:t>
       </w:r>
       <w:r>
         <w:rPr>
-          <w:rFonts w:hint="default" w:ascii="Arial" w:hAnsi="Arial" w:cs="Arial"/>
-          <w:sz w:val="24"/>
-          <w:szCs w:val="24"/>
+          <w:rFonts w:hint="default" w:ascii="Calibri" w:hAnsi="Calibri" w:cs="Calibri"/>
+          <w:sz w:val="22"/>
+          <w:szCs w:val="22"/>
           <w:lang w:val="en-US"/>
         </w:rPr>
         <w:t xml:space="preserve">[[Book No.]]                                                        </w:t>
       </w:r>
       <w:r>
         <w:rPr>
-          <w:rFonts w:hint="default" w:ascii="Arial" w:hAnsi="Arial" w:cs="Arial"/>
-          <w:sz w:val="24"/>
-          <w:szCs w:val="24"/>
+          <w:rFonts w:hint="default" w:ascii="Calibri" w:hAnsi="Calibri" w:cs="Calibri"/>
+          <w:sz w:val="22"/>
+          <w:szCs w:val="22"/>
           <w:lang w:val="en-US"/>
         </w:rPr>
         <w:br w:type="textWrapping"/>
       </w:r>
       <w:r>
         <w:rPr>
-          <w:rFonts w:hint="default" w:ascii="Arial" w:hAnsi="Arial" w:cs="Arial"/>
-          <w:sz w:val="24"/>
-          <w:szCs w:val="24"/>
+          <w:rFonts w:hint="default" w:ascii="Calibri" w:hAnsi="Calibri" w:cs="Calibri"/>
+          <w:sz w:val="22"/>
+          <w:szCs w:val="22"/>
         </w:rPr>
         <w:t>Series of</w:t>
       </w:r>
       <w:r>
         <w:rPr>
-          <w:rFonts w:hint="default" w:ascii="Arial" w:hAnsi="Arial" w:cs="Arial"/>
-          <w:sz w:val="24"/>
-          <w:szCs w:val="24"/>
+          <w:rFonts w:hint="default" w:ascii="Calibri" w:hAnsi="Calibri" w:cs="Calibri"/>
+          <w:sz w:val="22"/>
+          <w:szCs w:val="22"/>
           <w:lang w:val="en-US"/>
         </w:rPr>
         <w:t xml:space="preserve"> [[Series year]]</w:t>
@@ -1534,7 +1541,7 @@
     <w:lsdException w:qFormat="1" w:unhideWhenUsed="0" w:uiPriority="66" w:semiHidden="0" w:name="Medium List 2"/>
     <w:lsdException w:qFormat="1" w:unhideWhenUsed="0" w:uiPriority="67" w:semiHidden="0" w:name="Medium Grid 1"/>
     <w:lsdException w:qFormat="1" w:unhideWhenUsed="0" w:uiPriority="68" w:semiHidden="0" w:name="Medium Grid 2"/>
-    <w:lsdException w:unhideWhenUsed="0" w:uiPriority="69" w:semiHidden="0" w:name="Medium Grid 3"/>
+    <w:lsdException w:qFormat="1" w:unhideWhenUsed="0" w:uiPriority="69" w:semiHidden="0" w:name="Medium Grid 3"/>
     <w:lsdException w:qFormat="1" w:unhideWhenUsed="0" w:uiPriority="70" w:semiHidden="0" w:name="Dark List"/>
     <w:lsdException w:qFormat="1" w:unhideWhenUsed="0" w:uiPriority="71" w:semiHidden="0" w:name="Colorful Shading"/>
     <w:lsdException w:qFormat="1" w:unhideWhenUsed="0" w:uiPriority="72" w:semiHidden="0" w:name="Colorful List"/>
@@ -9492,6 +9499,7 @@
   <w:style w:type="table" w:styleId="100">
     <w:name w:val="Medium Grid 3"/>
     <w:basedOn w:val="12"/>
+    <w:qFormat/>
     <w:uiPriority w:val="69"/>
     <w:pPr>
       <w:spacing w:after="0" w:line="240" w:lineRule="auto"/>

</xml_diff>